<commit_message>
Update bilingual ATS-ready CVs
</commit_message>
<xml_diff>
--- a/documents/cv/Joaquin_Oviedo_CV_EN.docx
+++ b/documents/cv/Joaquin_Oviedo_CV_EN.docx
@@ -4,7 +4,7 @@
   <w:body>
     <w:p>
       <w:pPr>
-        <w:spacing w:after="10"/>
+        <w:spacing w:after="0"/>
         <w:jc w:val="center"/>
       </w:pPr>
       <w:r>
@@ -12,15 +12,15 @@
           <w:rFonts w:ascii="Arial" w:hAnsi="Arial"/>
           <w:b/>
           <w:i w:val="0"/>
-          <w:color w:val="121212"/>
+          <w:color w:val="181818"/>
           <w:sz w:val="35"/>
         </w:rPr>
-        <w:t>JOAQUIN NICOLAS OVIEDO</w:t>
+        <w:t>Joaquín Nicolás Oviedo</w:t>
       </w:r>
     </w:p>
     <w:p>
       <w:pPr>
-        <w:spacing w:after="36"/>
+        <w:spacing w:after="30"/>
         <w:jc w:val="center"/>
       </w:pPr>
       <w:r>
@@ -28,37 +28,34 @@
           <w:rFonts w:ascii="Arial" w:hAnsi="Arial"/>
           <w:b/>
           <w:i w:val="0"/>
-          <w:color w:val="4B4B4B"/>
-          <w:sz w:val="18"/>
+          <w:color w:val="464646"/>
+          <w:sz w:val="20"/>
         </w:rPr>
-        <w:t>DEVELOPMENT SUPERVISOR &amp; POWER PLATFORM DEVELOPER</w:t>
+        <w:t>Development Supervisor | Power Platform &amp; Software Developer</w:t>
       </w:r>
     </w:p>
     <w:p>
       <w:pPr>
-        <w:spacing w:after="50"/>
+        <w:spacing w:after="16"/>
         <w:jc w:val="center"/>
-        <w:pBdr>
-          <w:bottom w:val="single" w:sz="7" w:space="2" w:color="353535"/>
-        </w:pBdr>
       </w:pPr>
       <w:r>
         <w:rPr>
           <w:rFonts w:ascii="Arial" w:hAnsi="Arial"/>
           <w:b w:val="0"/>
           <w:i w:val="0"/>
-          <w:color w:val="121212"/>
-          <w:sz w:val="16"/>
+          <w:color w:val="181818"/>
+          <w:sz w:val="17"/>
         </w:rPr>
         <w:t xml:space="preserve">Argentina | </w:t>
       </w:r>
       <w:hyperlink r:id="rId9">
         <w:r>
           <w:rPr>
-            <w:color w:val="1F1F1F"/>
+            <w:rFonts w:ascii="Arial" w:hAnsi="Arial"/>
+            <w:color w:val="202020"/>
             <w:u w:val="single"/>
-            <w:sz w:val="16"/>
-            <w:rFonts w:ascii="Arial" w:hAnsi="Arial"/>
+            <w:sz w:val="18"/>
           </w:rPr>
           <w:t>joaquin.oviedo.fernandez@gmail.com</w:t>
         </w:r>
@@ -68,18 +65,18 @@
           <w:rFonts w:ascii="Arial" w:hAnsi="Arial"/>
           <w:b w:val="0"/>
           <w:i w:val="0"/>
-          <w:color w:val="121212"/>
-          <w:sz w:val="16"/>
+          <w:color w:val="181818"/>
+          <w:sz w:val="17"/>
         </w:rPr>
         <w:t xml:space="preserve"> | </w:t>
       </w:r>
       <w:hyperlink r:id="rId10">
         <w:r>
           <w:rPr>
-            <w:color w:val="1F1F1F"/>
+            <w:rFonts w:ascii="Arial" w:hAnsi="Arial"/>
+            <w:color w:val="202020"/>
             <w:u w:val="single"/>
-            <w:sz w:val="16"/>
-            <w:rFonts w:ascii="Arial" w:hAnsi="Arial"/>
+            <w:sz w:val="18"/>
           </w:rPr>
           <w:t>linkedin.com/in/joaquin-oviedo</w:t>
         </w:r>
@@ -89,18 +86,18 @@
           <w:rFonts w:ascii="Arial" w:hAnsi="Arial"/>
           <w:b w:val="0"/>
           <w:i w:val="0"/>
-          <w:color w:val="121212"/>
-          <w:sz w:val="16"/>
+          <w:color w:val="181818"/>
+          <w:sz w:val="17"/>
         </w:rPr>
         <w:t xml:space="preserve"> | </w:t>
       </w:r>
       <w:hyperlink r:id="rId11">
         <w:r>
           <w:rPr>
-            <w:color w:val="1F1F1F"/>
+            <w:rFonts w:ascii="Arial" w:hAnsi="Arial"/>
+            <w:color w:val="202020"/>
             <w:u w:val="single"/>
-            <w:sz w:val="16"/>
-            <w:rFonts w:ascii="Arial" w:hAnsi="Arial"/>
+            <w:sz w:val="18"/>
           </w:rPr>
           <w:t>github.com/JoaquinOviedo</w:t>
         </w:r>
@@ -108,74 +105,86 @@
     </w:p>
     <w:p>
       <w:pPr>
-        <w:pStyle w:val="SectionHeading"/>
-        <w:spacing w:before="110" w:after="50"/>
+        <w:spacing w:after="20"/>
+        <w:jc w:val="center"/>
         <w:pBdr>
-          <w:bottom w:val="single" w:sz="7" w:space="2" w:color="353535"/>
+          <w:bottom w:val="single" w:sz="5" w:space="2" w:color="777777"/>
         </w:pBdr>
-        <w:keepNext/>
+      </w:pPr>
+      <w:hyperlink r:id="rId12">
+        <w:r>
+          <w:rPr>
+            <w:rFonts w:ascii="Arial" w:hAnsi="Arial"/>
+            <w:color w:val="202020"/>
+            <w:u w:val="single"/>
+            <w:sz w:val="17"/>
+          </w:rPr>
+          <w:t>joaquinoviedo.github.io/Website</w:t>
+        </w:r>
+      </w:hyperlink>
+    </w:p>
+    <w:p>
+      <w:pPr>
+        <w:spacing w:before="90" w:after="40"/>
+        <w:pBdr>
+          <w:bottom w:val="single" w:sz="5" w:space="2" w:color="777777"/>
+        </w:pBdr>
       </w:pPr>
       <w:r>
         <w:rPr>
           <w:rFonts w:ascii="Arial" w:hAnsi="Arial"/>
           <w:b/>
           <w:i w:val="0"/>
-          <w:color w:val="121212"/>
-          <w:sz w:val="18"/>
+          <w:color w:val="181818"/>
+          <w:sz w:val="20"/>
         </w:rPr>
         <w:t>PROFESSIONAL SUMMARY</w:t>
       </w:r>
     </w:p>
     <w:p>
       <w:pPr>
-        <w:pStyle w:val="Compact"/>
+        <w:spacing w:after="20"/>
       </w:pPr>
       <w:r>
         <w:rPr>
           <w:rFonts w:ascii="Arial" w:hAnsi="Arial"/>
           <w:b w:val="0"/>
           <w:i w:val="0"/>
-          <w:color w:val="121212"/>
-          <w:sz w:val="17"/>
+          <w:color w:val="181818"/>
+          <w:sz w:val="19"/>
         </w:rPr>
-        <w:t>Software developer and development supervisor experienced in enterprise solutions, Power Platform, and backend development. I combine discovery, estimation, prioritization, and operational leadership with a technical foundation in .NET, React, and TypeScript. Focused on clear, maintainable, people-centered products.</w:t>
+        <w:t>Development supervisor and software developer experienced in enterprise solutions with Power Platform, .NET, React, and TypeScript. I manage product evolution from discovery and feasibility through prioritization, delegation, and delivery. I take ownership of problems and use AI to explore and validate faster while remaining accountable for technical decisions, quality, and outcomes.</w:t>
       </w:r>
     </w:p>
     <w:p>
       <w:pPr>
-        <w:pStyle w:val="SectionHeading"/>
-        <w:spacing w:before="110" w:after="50"/>
+        <w:spacing w:before="90" w:after="40"/>
         <w:pBdr>
-          <w:bottom w:val="single" w:sz="7" w:space="2" w:color="353535"/>
+          <w:bottom w:val="single" w:sz="5" w:space="2" w:color="777777"/>
         </w:pBdr>
-        <w:keepNext/>
       </w:pPr>
       <w:r>
         <w:rPr>
           <w:rFonts w:ascii="Arial" w:hAnsi="Arial"/>
           <w:b/>
           <w:i w:val="0"/>
-          <w:color w:val="121212"/>
-          <w:sz w:val="18"/>
+          <w:color w:val="181818"/>
+          <w:sz w:val="20"/>
         </w:rPr>
-        <w:t>EXPERIENCE</w:t>
+        <w:t>PROFESSIONAL EXPERIENCE</w:t>
       </w:r>
     </w:p>
     <w:p>
       <w:pPr>
-        <w:pStyle w:val="ItemHeading"/>
-        <w:tabs>
-          <w:tab w:pos="10584" w:val="right"/>
-        </w:tabs>
-        <w:keepNext/>
+        <w:spacing w:before="40" w:after="10"/>
       </w:pPr>
       <w:r>
         <w:rPr>
           <w:rFonts w:ascii="Arial" w:hAnsi="Arial"/>
           <w:b/>
           <w:i w:val="0"/>
-          <w:color w:val="121212"/>
-          <w:sz w:val="18"/>
+          <w:color w:val="181818"/>
+          <w:sz w:val="19"/>
         </w:rPr>
         <w:t>Circo Studio | Projects for YPF</w:t>
       </w:r>
@@ -184,190 +193,171 @@
           <w:rFonts w:ascii="Arial" w:hAnsi="Arial"/>
           <w:b/>
           <w:i w:val="0"/>
-          <w:color w:val="121212"/>
-          <w:sz w:val="17"/>
+          <w:color w:val="464646"/>
+          <w:sz w:val="18"/>
         </w:rPr>
-        <w:tab/>
-        <w:t>March 2024 - Present</w:t>
+        <w:t xml:space="preserve"> | March 2024 - Present</w:t>
       </w:r>
+    </w:p>
+    <w:p>
+      <w:pPr>
+        <w:spacing w:after="10"/>
+      </w:pPr>
       <w:r>
         <w:rPr>
           <w:rFonts w:ascii="Arial" w:hAnsi="Arial"/>
           <w:b w:val="0"/>
           <w:i/>
-          <w:color w:val="4B4B4B"/>
-          <w:sz w:val="17"/>
+          <w:color w:val="464646"/>
+          <w:sz w:val="18"/>
         </w:rPr>
-        <w:br/>
-        <w:t>Development Supervisor &amp; Power Platform Developer | Buenos Aires, Argentina</w:t>
+        <w:t>Development Supervisor and Power Platform Developer</w:t>
       </w:r>
     </w:p>
     <w:p>
       <w:pPr>
-        <w:pStyle w:val="ResumeBullet"/>
+        <w:pStyle w:val="ListBullet"/>
       </w:pPr>
       <w:r>
         <w:rPr>
           <w:rFonts w:ascii="Arial" w:hAnsi="Arial"/>
           <w:b w:val="0"/>
           <w:i w:val="0"/>
-          <w:color w:val="121212"/>
-          <w:sz w:val="17"/>
+          <w:color w:val="181818"/>
+          <w:sz w:val="19"/>
         </w:rPr>
-        <w:t>Manage the day-to-day evolution of a cross-company corporate application: gather requests with the client user and functional analysis, assess feasibility, estimate, prioritize, and delegate work.</w:t>
+        <w:t>Manage the day-to-day evolution of a cross-company corporate application: gather requests with the client user and functional analyst, assess feasibility, estimate, prioritize, and delegate work.</w:t>
       </w:r>
     </w:p>
     <w:p>
       <w:pPr>
-        <w:pStyle w:val="ResumeBullet"/>
+        <w:pStyle w:val="ListBullet"/>
       </w:pPr>
       <w:r>
         <w:rPr>
           <w:rFonts w:ascii="Arial" w:hAnsi="Arial"/>
           <w:b w:val="0"/>
           <w:i w:val="0"/>
-          <w:color w:val="121212"/>
-          <w:sz w:val="17"/>
+          <w:color w:val="181818"/>
+          <w:sz w:val="19"/>
         </w:rPr>
-        <w:t>Designed and built a reusable Power Apps UX framework with the design team, standardizing components, styles, and screens to improve consistency and reuse.</w:t>
+        <w:t>Document use cases and validations; perform functional testing and capture evidence with Azure DevOps Test &amp; Feedback to support releases and issue tracking.</w:t>
       </w:r>
     </w:p>
     <w:p>
       <w:pPr>
-        <w:pStyle w:val="ResumeBullet"/>
+        <w:pStyle w:val="ListBullet"/>
       </w:pPr>
       <w:r>
         <w:rPr>
           <w:rFonts w:ascii="Arial" w:hAnsi="Arial"/>
           <w:b w:val="0"/>
           <w:i w:val="0"/>
-          <w:color w:val="121212"/>
-          <w:sz w:val="17"/>
+          <w:color w:val="181818"/>
+          <w:sz w:val="19"/>
         </w:rPr>
-        <w:t>Train new team members, coordinate framework contributions, and support delivery while anticipating dependencies, risks, and future product needs.</w:t>
+        <w:t>Manage roles and permissions across Dataverse, SharePoint sites and groups, and Microsoft Entra ID groups, aligning access with each user profile's responsibilities.</w:t>
       </w:r>
     </w:p>
     <w:p>
       <w:pPr>
-        <w:pStyle w:val="ResumeBullet"/>
+        <w:pStyle w:val="ListBullet"/>
       </w:pPr>
       <w:r>
         <w:rPr>
           <w:rFonts w:ascii="Arial" w:hAnsi="Arial"/>
           <w:b w:val="0"/>
           <w:i w:val="0"/>
-          <w:color w:val="121212"/>
-          <w:sz w:val="17"/>
+          <w:color w:val="181818"/>
+          <w:sz w:val="19"/>
         </w:rPr>
-        <w:t>Additional experience with Power Automate, SharePoint, Azure DevOps, Git, and PowerShell; initial training in React, TypeScript, and SharePoint Framework.</w:t>
+        <w:t>Built and continue to evolve a reusable Power Apps UX framework with the design team; coordinate improvements, delegate tasks, and train new team members to sustain consistency and reuse.</w:t>
       </w:r>
     </w:p>
     <w:p>
       <w:pPr>
-        <w:pStyle w:val="SectionHeading"/>
-        <w:spacing w:before="110" w:after="50"/>
+        <w:spacing w:before="90" w:after="40"/>
         <w:pBdr>
-          <w:bottom w:val="single" w:sz="7" w:space="2" w:color="353535"/>
+          <w:bottom w:val="single" w:sz="5" w:space="2" w:color="777777"/>
         </w:pBdr>
-        <w:keepNext/>
       </w:pPr>
       <w:r>
         <w:rPr>
           <w:rFonts w:ascii="Arial" w:hAnsi="Arial"/>
           <w:b/>
           <w:i w:val="0"/>
-          <w:color w:val="121212"/>
-          <w:sz w:val="18"/>
+          <w:color w:val="181818"/>
+          <w:sz w:val="20"/>
         </w:rPr>
         <w:t>SELECTED PROJECTS</w:t>
       </w:r>
     </w:p>
     <w:p>
       <w:pPr>
-        <w:pStyle w:val="ItemHeading"/>
-        <w:tabs>
-          <w:tab w:pos="10584" w:val="right"/>
-        </w:tabs>
-        <w:keepNext/>
+        <w:spacing w:before="40" w:after="10"/>
       </w:pPr>
       <w:r>
         <w:rPr>
           <w:rFonts w:ascii="Arial" w:hAnsi="Arial"/>
           <w:b/>
           <w:i w:val="0"/>
-          <w:color w:val="121212"/>
-          <w:sz w:val="18"/>
+          <w:color w:val="181818"/>
+          <w:sz w:val="19"/>
         </w:rPr>
-        <w:t>WIRIN | Backend Developer</w:t>
+        <w:t>WIRIN | Backend Developer | Academic team project</w:t>
       </w:r>
       <w:r>
         <w:rPr>
           <w:rFonts w:ascii="Arial" w:hAnsi="Arial"/>
           <w:b/>
           <w:i w:val="0"/>
-          <w:color w:val="121212"/>
-          <w:sz w:val="17"/>
+          <w:color w:val="464646"/>
+          <w:sz w:val="18"/>
         </w:rPr>
-        <w:tab/>
-        <w:t>2025</w:t>
-      </w:r>
-      <w:r>
-        <w:rPr>
-          <w:rFonts w:ascii="Arial" w:hAnsi="Arial"/>
-          <w:b w:val="0"/>
-          <w:i/>
-          <w:color w:val="4B4B4B"/>
-          <w:sz w:val="17"/>
-        </w:rPr>
-        <w:br/>
-        <w:t>Academic team project - UNLaM</w:t>
+        <w:t xml:space="preserve"> | 2025 - Present</w:t>
       </w:r>
     </w:p>
     <w:p>
       <w:pPr>
-        <w:pStyle w:val="ResumeBullet"/>
+        <w:pStyle w:val="ListBullet"/>
       </w:pPr>
       <w:r>
         <w:rPr>
           <w:rFonts w:ascii="Arial" w:hAnsi="Arial"/>
           <w:b w:val="0"/>
           <w:i w:val="0"/>
-          <w:color w:val="121212"/>
-          <w:sz w:val="17"/>
+          <w:color w:val="181818"/>
+          <w:sz w:val="19"/>
         </w:rPr>
         <w:t>Contributed mainly to the backend of a bibliographic accessibility system: ASP.NET Core Web API on .NET 8, Entity Framework Core, JWT, SQL Server/PostgreSQL, and Azure OCR integration.</w:t>
       </w:r>
     </w:p>
     <w:p>
       <w:pPr>
-        <w:pStyle w:val="ResumeBullet"/>
+        <w:pStyle w:val="ListBullet"/>
       </w:pPr>
       <w:r>
         <w:rPr>
           <w:rFonts w:ascii="Arial" w:hAnsi="Arial"/>
           <w:b w:val="0"/>
           <w:i w:val="0"/>
-          <w:color w:val="121212"/>
-          <w:sz w:val="17"/>
+          <w:color w:val="181818"/>
+          <w:sz w:val="19"/>
         </w:rPr>
-        <w:t>The platform coordinates digitization, volunteer tasks, statuses, administration, and users; the team presented WIRIN at UNLaM's 23rd University Digital Library Conference in November 2025.</w:t>
+        <w:t>The team presented WIRIN at the 23rd University Digital Library Conference and is validating the product with UNLaM's library before a potential formal implementation.</w:t>
       </w:r>
     </w:p>
     <w:p>
       <w:pPr>
-        <w:pStyle w:val="ItemHeading"/>
-        <w:tabs>
-          <w:tab w:pos="10584" w:val="right"/>
-        </w:tabs>
-        <w:keepNext/>
+        <w:spacing w:before="40" w:after="10"/>
       </w:pPr>
       <w:r>
         <w:rPr>
           <w:rFonts w:ascii="Arial" w:hAnsi="Arial"/>
           <w:b/>
           <w:i w:val="0"/>
-          <w:color w:val="121212"/>
-          <w:sz w:val="18"/>
+          <w:color w:val="181818"/>
+          <w:sz w:val="19"/>
         </w:rPr>
         <w:t>Local personal applications | AI-assisted development</w:t>
       </w:r>
@@ -376,258 +366,261 @@
           <w:rFonts w:ascii="Arial" w:hAnsi="Arial"/>
           <w:b/>
           <w:i w:val="0"/>
-          <w:color w:val="121212"/>
-          <w:sz w:val="17"/>
+          <w:color w:val="464646"/>
+          <w:sz w:val="18"/>
         </w:rPr>
-        <w:tab/>
-        <w:t>2026</w:t>
+        <w:t xml:space="preserve"> | 2026</w:t>
       </w:r>
     </w:p>
     <w:p>
       <w:pPr>
-        <w:pStyle w:val="ResumeBullet"/>
+        <w:pStyle w:val="ListBullet"/>
       </w:pPr>
       <w:r>
         <w:rPr>
           <w:rFonts w:ascii="Arial" w:hAnsi="Arial"/>
           <w:b w:val="0"/>
           <w:i w:val="0"/>
-          <w:color w:val="121212"/>
-          <w:sz w:val="17"/>
+          <w:color w:val="181818"/>
+          <w:sz w:val="19"/>
         </w:rPr>
-        <w:t>Built React and TypeScript tools for personal finance management and Technology Management degree tracking, with privacy and local persistence as core constraints.</w:t>
+        <w:t>Defined and built React and TypeScript tools for personal finance management and academic tracking, prioritizing real needs, privacy, and local persistence.</w:t>
       </w:r>
     </w:p>
     <w:p>
       <w:pPr>
-        <w:pStyle w:val="SectionHeading"/>
-        <w:spacing w:before="110" w:after="50"/>
+        <w:spacing w:before="90" w:after="40"/>
         <w:pBdr>
-          <w:bottom w:val="single" w:sz="7" w:space="2" w:color="353535"/>
+          <w:bottom w:val="single" w:sz="5" w:space="2" w:color="777777"/>
         </w:pBdr>
-        <w:keepNext/>
       </w:pPr>
       <w:r>
         <w:rPr>
           <w:rFonts w:ascii="Arial" w:hAnsi="Arial"/>
           <w:b/>
           <w:i w:val="0"/>
-          <w:color w:val="121212"/>
-          <w:sz w:val="18"/>
+          <w:color w:val="181818"/>
+          <w:sz w:val="20"/>
         </w:rPr>
         <w:t>EDUCATION</w:t>
       </w:r>
     </w:p>
     <w:p>
       <w:pPr>
-        <w:pStyle w:val="ItemHeading"/>
-        <w:tabs>
-          <w:tab w:pos="10584" w:val="right"/>
-        </w:tabs>
-        <w:keepNext/>
+        <w:spacing w:before="40" w:after="10"/>
       </w:pPr>
       <w:r>
         <w:rPr>
           <w:rFonts w:ascii="Arial" w:hAnsi="Arial"/>
           <w:b/>
           <w:i w:val="0"/>
-          <w:color w:val="121212"/>
-          <w:sz w:val="18"/>
+          <w:color w:val="181818"/>
+          <w:sz w:val="19"/>
         </w:rPr>
-        <w:t>Bachelor's Degree in Technology Management | UNLaM</w:t>
+        <w:t>Bachelor's Degree in Technology Management | Universidad Nacional de La Matanza</w:t>
       </w:r>
       <w:r>
         <w:rPr>
           <w:rFonts w:ascii="Arial" w:hAnsi="Arial"/>
           <w:b/>
           <w:i w:val="0"/>
-          <w:color w:val="121212"/>
-          <w:sz w:val="17"/>
+          <w:color w:val="464646"/>
+          <w:sz w:val="18"/>
         </w:rPr>
-        <w:tab/>
-        <w:t>2026 - 2027</w:t>
-      </w:r>
-      <w:r>
-        <w:rPr>
-          <w:rFonts w:ascii="Arial" w:hAnsi="Arial"/>
-          <w:b w:val="0"/>
-          <w:i/>
-          <w:color w:val="4B4B4B"/>
-          <w:sz w:val="17"/>
-        </w:rPr>
-        <w:br/>
-        <w:t>In progress</w:t>
+        <w:t xml:space="preserve"> | 2026 - 2027 | In progress</w:t>
       </w:r>
     </w:p>
     <w:p>
       <w:pPr>
-        <w:pStyle w:val="ItemHeading"/>
-        <w:tabs>
-          <w:tab w:pos="10584" w:val="right"/>
-        </w:tabs>
-        <w:keepNext/>
+        <w:spacing w:before="40" w:after="10"/>
       </w:pPr>
       <w:r>
         <w:rPr>
           <w:rFonts w:ascii="Arial" w:hAnsi="Arial"/>
           <w:b/>
           <w:i w:val="0"/>
-          <w:color w:val="121212"/>
-          <w:sz w:val="18"/>
+          <w:color w:val="181818"/>
+          <w:sz w:val="19"/>
         </w:rPr>
-        <w:t>University Degree in Web Development | UNLaM</w:t>
+        <w:t>University Degree in Web Development | Universidad Nacional de La Matanza</w:t>
       </w:r>
       <w:r>
         <w:rPr>
           <w:rFonts w:ascii="Arial" w:hAnsi="Arial"/>
           <w:b/>
           <w:i w:val="0"/>
-          <w:color w:val="121212"/>
-          <w:sz w:val="17"/>
+          <w:color w:val="464646"/>
+          <w:sz w:val="18"/>
         </w:rPr>
-        <w:tab/>
-        <w:t>2022 - 2025</w:t>
-      </w:r>
-      <w:r>
-        <w:rPr>
-          <w:rFonts w:ascii="Arial" w:hAnsi="Arial"/>
-          <w:b w:val="0"/>
-          <w:i/>
-          <w:color w:val="4B4B4B"/>
-          <w:sz w:val="17"/>
-        </w:rPr>
-        <w:br/>
-        <w:t>GPA: 8.6/10</w:t>
+        <w:t xml:space="preserve"> | 2022 - 2025 | GPA: 8.6/10</w:t>
       </w:r>
     </w:p>
     <w:p>
       <w:pPr>
-        <w:pStyle w:val="ItemHeading"/>
-        <w:tabs>
-          <w:tab w:pos="10584" w:val="right"/>
-        </w:tabs>
-        <w:keepNext/>
+        <w:spacing w:before="40" w:after="10"/>
       </w:pPr>
       <w:r>
         <w:rPr>
           <w:rFonts w:ascii="Arial" w:hAnsi="Arial"/>
           <w:b/>
           <w:i w:val="0"/>
-          <w:color w:val="121212"/>
-          <w:sz w:val="18"/>
+          <w:color w:val="181818"/>
+          <w:sz w:val="19"/>
         </w:rPr>
-        <w:t>Electronics Technician | Instituto San Jose (A-355)</w:t>
+        <w:t>Electronics Technician | Instituto San José (A-355)</w:t>
       </w:r>
       <w:r>
         <w:rPr>
           <w:rFonts w:ascii="Arial" w:hAnsi="Arial"/>
           <w:b/>
           <w:i w:val="0"/>
-          <w:color w:val="121212"/>
-          <w:sz w:val="17"/>
+          <w:color w:val="464646"/>
+          <w:sz w:val="18"/>
         </w:rPr>
-        <w:tab/>
-        <w:t>2014 - 2019</w:t>
+        <w:t xml:space="preserve"> | 2014 - 2019</w:t>
       </w:r>
     </w:p>
     <w:p>
       <w:pPr>
-        <w:pStyle w:val="SectionHeading"/>
-        <w:spacing w:before="110" w:after="50"/>
+        <w:spacing w:before="90" w:after="40"/>
         <w:pBdr>
-          <w:bottom w:val="single" w:sz="7" w:space="2" w:color="353535"/>
+          <w:bottom w:val="single" w:sz="5" w:space="2" w:color="777777"/>
         </w:pBdr>
-        <w:keepNext/>
       </w:pPr>
       <w:r>
         <w:rPr>
           <w:rFonts w:ascii="Arial" w:hAnsi="Arial"/>
           <w:b/>
           <w:i w:val="0"/>
-          <w:color w:val="121212"/>
-          <w:sz w:val="18"/>
+          <w:color w:val="181818"/>
+          <w:sz w:val="20"/>
         </w:rPr>
-        <w:t>TECHNOLOGIES AND LANGUAGES</w:t>
+        <w:t>SKILLS</w:t>
       </w:r>
     </w:p>
     <w:p>
       <w:pPr>
-        <w:pStyle w:val="Compact"/>
+        <w:spacing w:after="20"/>
       </w:pPr>
       <w:r>
         <w:rPr>
           <w:rFonts w:ascii="Arial" w:hAnsi="Arial"/>
           <w:b/>
           <w:i w:val="0"/>
-          <w:color w:val="121212"/>
-          <w:sz w:val="16"/>
+          <w:color w:val="181818"/>
+          <w:sz w:val="19"/>
         </w:rPr>
-        <w:t xml:space="preserve">Technologies: </w:t>
+        <w:t xml:space="preserve">Power Platform: </w:t>
       </w:r>
       <w:r>
         <w:rPr>
           <w:rFonts w:ascii="Arial" w:hAnsi="Arial"/>
           <w:b w:val="0"/>
           <w:i w:val="0"/>
-          <w:color w:val="121212"/>
-          <w:sz w:val="16"/>
+          <w:color w:val="181818"/>
+          <w:sz w:val="19"/>
         </w:rPr>
-        <w:t>Power Apps, Power Automate, .NET 8, ASP.NET Core, React, TypeScript, Angular, SQL, SharePoint, Azure, Git, Azure DevOps, and PowerShell</w:t>
+        <w:t>Power Apps, Power Automate, Dataverse, SharePoint, role and permission management</w:t>
       </w:r>
     </w:p>
     <w:p>
       <w:pPr>
-        <w:pStyle w:val="Compact"/>
+        <w:spacing w:after="20"/>
       </w:pPr>
       <w:r>
         <w:rPr>
           <w:rFonts w:ascii="Arial" w:hAnsi="Arial"/>
           <w:b/>
           <w:i w:val="0"/>
-          <w:color w:val="121212"/>
-          <w:sz w:val="16"/>
+          <w:color w:val="181818"/>
+          <w:sz w:val="19"/>
         </w:rPr>
-        <w:t xml:space="preserve">Languages: </w:t>
+        <w:t xml:space="preserve">Development: </w:t>
       </w:r>
       <w:r>
         <w:rPr>
           <w:rFonts w:ascii="Arial" w:hAnsi="Arial"/>
           <w:b w:val="0"/>
           <w:i w:val="0"/>
-          <w:color w:val="121212"/>
-          <w:sz w:val="16"/>
+          <w:color w:val="181818"/>
+          <w:sz w:val="19"/>
         </w:rPr>
-        <w:t>Spanish: native | English: B2 | Portuguese: A2</w:t>
+        <w:t>.NET 8, ASP.NET Core Web API, React, TypeScript, Angular, Node.js</w:t>
       </w:r>
     </w:p>
     <w:p>
       <w:pPr>
-        <w:pStyle w:val="Compact"/>
+        <w:spacing w:after="20"/>
       </w:pPr>
       <w:r>
         <w:rPr>
           <w:rFonts w:ascii="Arial" w:hAnsi="Arial"/>
           <w:b/>
           <w:i w:val="0"/>
-          <w:color w:val="121212"/>
-          <w:sz w:val="16"/>
+          <w:color w:val="181818"/>
+          <w:sz w:val="19"/>
         </w:rPr>
-        <w:t xml:space="preserve">Additional training: </w:t>
+        <w:t xml:space="preserve">Data, Azure, and delivery: </w:t>
       </w:r>
       <w:r>
         <w:rPr>
           <w:rFonts w:ascii="Arial" w:hAnsi="Arial"/>
           <w:b w:val="0"/>
           <w:i w:val="0"/>
-          <w:color w:val="121212"/>
-          <w:sz w:val="16"/>
+          <w:color w:val="181818"/>
+          <w:sz w:val="19"/>
         </w:rPr>
-        <w:t>Data Science course - UTN (November 2024)</w:t>
+        <w:t>Entity Framework Core, SQL Server, PostgreSQL, Azure, Azure DevOps, Git, Test &amp; Feedback</w:t>
+      </w:r>
+    </w:p>
+    <w:p>
+      <w:pPr>
+        <w:spacing w:before="90" w:after="40"/>
+        <w:pBdr>
+          <w:bottom w:val="single" w:sz="5" w:space="2" w:color="777777"/>
+        </w:pBdr>
+      </w:pPr>
+      <w:r>
+        <w:rPr>
+          <w:rFonts w:ascii="Arial" w:hAnsi="Arial"/>
+          <w:b/>
+          <w:i w:val="0"/>
+          <w:color w:val="181818"/>
+          <w:sz w:val="20"/>
+        </w:rPr>
+        <w:t>LANGUAGES AND TRAINING</w:t>
+      </w:r>
+    </w:p>
+    <w:p>
+      <w:pPr>
+        <w:spacing w:after="20"/>
+      </w:pPr>
+      <w:r>
+        <w:rPr>
+          <w:rFonts w:ascii="Arial" w:hAnsi="Arial"/>
+          <w:b w:val="0"/>
+          <w:i w:val="0"/>
+          <w:color w:val="181818"/>
+          <w:sz w:val="18"/>
+        </w:rPr>
+        <w:t>Spanish: native | English: upper-intermediate, Cambridge First-oriented coursework and functional workplace communication | Portuguese: A2 course completed</w:t>
+      </w:r>
+    </w:p>
+    <w:p>
+      <w:r>
+        <w:rPr>
+          <w:rFonts w:ascii="Arial" w:hAnsi="Arial"/>
+          <w:b w:val="0"/>
+          <w:i w:val="0"/>
+          <w:color w:val="181818"/>
+          <w:sz w:val="18"/>
+        </w:rPr>
+        <w:t>Data Science course | Universidad Tecnológica Nacional (UTN) | November 2024</w:t>
       </w:r>
     </w:p>
     <w:sectPr>
-      <w:pgSz w:w="12240" w:h="15840"/>
-      <w:pgMar w:top="619" w:right="821" w:bottom="619" w:left="821" w:header="288" w:footer="288" w:gutter="0"/>
+      <w:pgSz w:w="11906" w:h="16838"/>
+      <w:pgMar w:top="749" w:right="936" w:bottom="691" w:left="936" w:header="720" w:footer="720" w:gutter="0"/>
       <w:cols w:space="720"/>
       <w:docGrid w:linePitch="360"/>
     </w:sectPr>
@@ -999,11 +992,11 @@
     <w:qFormat/>
     <w:rsid w:val="00FC693F"/>
     <w:pPr>
-      <w:spacing w:after="36" w:line="245" w:lineRule="auto"/>
+      <w:spacing w:after="40" w:line="245" w:lineRule="auto"/>
     </w:pPr>
     <w:rPr>
       <w:rFonts w:ascii="Arial" w:hAnsi="Arial"/>
-      <w:sz w:val="17"/>
+      <w:sz w:val="20"/>
     </w:rPr>
   </w:style>
   <w:style w:type="paragraph" w:styleId="Header">
@@ -1532,8 +1525,14 @@
       <w:numPr>
         <w:numId w:val="1"/>
       </w:numPr>
+      <w:spacing w:after="30" w:line="240" w:lineRule="auto"/>
+      <w:ind w:left="288" w:hanging="202"/>
       <w:contextualSpacing/>
     </w:pPr>
+    <w:rPr>
+      <w:rFonts w:ascii="Arial" w:hAnsi="Arial"/>
+      <w:sz w:val="19"/>
+    </w:rPr>
   </w:style>
   <w:style w:type="paragraph" w:styleId="ListBullet2">
     <w:name w:val="List Bullet 2"/>
@@ -12687,46 +12686,6 @@
         <w:shd w:val="clear" w:color="auto" w:fill="FBCAA2" w:themeFill="accent6" w:themeFillTint="7F"/>
       </w:tcPr>
     </w:tblStylePr>
-  </w:style>
-  <w:style w:type="paragraph" w:customStyle="1" w:styleId="SectionHeading">
-    <w:name w:val="Section Heading"/>
-    <w:rPr>
-      <w:rFonts w:ascii="Arial" w:hAnsi="Arial"/>
-      <w:b/>
-      <w:sz w:val="18"/>
-    </w:rPr>
-  </w:style>
-  <w:style w:type="paragraph" w:customStyle="1" w:styleId="ItemHeading">
-    <w:name w:val="Item Heading"/>
-    <w:pPr>
-      <w:spacing w:before="50" w:after="30"/>
-    </w:pPr>
-    <w:rPr>
-      <w:rFonts w:ascii="Arial" w:hAnsi="Arial"/>
-      <w:sz w:val="18"/>
-    </w:rPr>
-  </w:style>
-  <w:style w:type="paragraph" w:customStyle="1" w:styleId="Compact">
-    <w:name w:val="Compact"/>
-    <w:pPr>
-      <w:spacing w:after="28" w:line="240" w:lineRule="auto"/>
-    </w:pPr>
-    <w:rPr>
-      <w:rFonts w:ascii="Arial" w:hAnsi="Arial"/>
-      <w:sz w:val="16"/>
-    </w:rPr>
-  </w:style>
-  <w:style w:type="paragraph" w:customStyle="1" w:styleId="ResumeBullet">
-    <w:name w:val="Resume Bullet"/>
-    <w:basedOn w:val="ListBullet"/>
-    <w:pPr>
-      <w:spacing w:after="25" w:line="240" w:lineRule="auto"/>
-      <w:ind w:left="245" w:hanging="187"/>
-    </w:pPr>
-    <w:rPr>
-      <w:rFonts w:ascii="Arial" w:hAnsi="Arial"/>
-      <w:sz w:val="17"/>
-    </w:rPr>
   </w:style>
 </w:styles>
 </file>

</xml_diff>

<commit_message>
Refine recruiter content and bilingual CVs
</commit_message>
<xml_diff>
--- a/documents/cv/Joaquin_Oviedo_CV_EN.docx
+++ b/documents/cv/Joaquin_Oviedo_CV_EN.docx
@@ -271,7 +271,7 @@
           <w:color w:val="181818"/>
           <w:sz w:val="19"/>
         </w:rPr>
-        <w:t>Built and continue to evolve a reusable Power Apps UX framework with the design team; coordinate improvements, delegate tasks, and train new team members to sustain consistency and reuse.</w:t>
+        <w:t>Built and continue to evolve a reusable Power Apps UX framework with the design team. Led its adoption through training for the development team and YPF stakeholders; currently coordinate improvements, delegate enhancements, and support new team members.</w:t>
       </w:r>
     </w:p>
     <w:p>
@@ -344,47 +344,7 @@
           <w:color w:val="181818"/>
           <w:sz w:val="19"/>
         </w:rPr>
-        <w:t>The team presented WIRIN at the 23rd University Digital Library Conference and is validating the product with UNLaM's library before a potential formal implementation.</w:t>
-      </w:r>
-    </w:p>
-    <w:p>
-      <w:pPr>
-        <w:spacing w:before="40" w:after="10"/>
-      </w:pPr>
-      <w:r>
-        <w:rPr>
-          <w:rFonts w:ascii="Arial" w:hAnsi="Arial"/>
-          <w:b/>
-          <w:i w:val="0"/>
-          <w:color w:val="181818"/>
-          <w:sz w:val="19"/>
-        </w:rPr>
-        <w:t>Local personal applications | AI-assisted development</w:t>
-      </w:r>
-      <w:r>
-        <w:rPr>
-          <w:rFonts w:ascii="Arial" w:hAnsi="Arial"/>
-          <w:b/>
-          <w:i w:val="0"/>
-          <w:color w:val="464646"/>
-          <w:sz w:val="18"/>
-        </w:rPr>
-        <w:t xml:space="preserve"> | 2026</w:t>
-      </w:r>
-    </w:p>
-    <w:p>
-      <w:pPr>
-        <w:pStyle w:val="ListBullet"/>
-      </w:pPr>
-      <w:r>
-        <w:rPr>
-          <w:rFonts w:ascii="Arial" w:hAnsi="Arial"/>
-          <w:b w:val="0"/>
-          <w:i w:val="0"/>
-          <w:color w:val="181818"/>
-          <w:sz w:val="19"/>
-        </w:rPr>
-        <w:t>Defined and built React and TypeScript tools for personal finance management and academic tracking, prioritizing real needs, privacy, and local persistence.</w:t>
+        <w:t>The team presented WIRIN at the 23rd University Digital Library Conference and is validating the product with library staff before its implementation at UNLaM's library.</w:t>
       </w:r>
     </w:p>
     <w:p>
@@ -495,7 +455,7 @@
           <w:color w:val="181818"/>
           <w:sz w:val="20"/>
         </w:rPr>
-        <w:t>SKILLS</w:t>
+        <w:t>TECHNICAL AND LEADERSHIP SKILLS</w:t>
       </w:r>
     </w:p>
     <w:p>
@@ -575,6 +535,31 @@
     </w:p>
     <w:p>
       <w:pPr>
+        <w:spacing w:after="20"/>
+      </w:pPr>
+      <w:r>
+        <w:rPr>
+          <w:rFonts w:ascii="Arial" w:hAnsi="Arial"/>
+          <w:b/>
+          <w:i w:val="0"/>
+          <w:color w:val="181818"/>
+          <w:sz w:val="19"/>
+        </w:rPr>
+        <w:t xml:space="preserve">Leadership and product: </w:t>
+      </w:r>
+      <w:r>
+        <w:rPr>
+          <w:rFonts w:ascii="Arial" w:hAnsi="Arial"/>
+          <w:b w:val="0"/>
+          <w:i w:val="0"/>
+          <w:color w:val="181818"/>
+          <w:sz w:val="19"/>
+        </w:rPr>
+        <w:t>User discovery, feasibility analysis, estimation, prioritization, delegation, training, and functional validation</w:t>
+      </w:r>
+    </w:p>
+    <w:p>
+      <w:pPr>
         <w:spacing w:before="90" w:after="40"/>
         <w:pBdr>
           <w:bottom w:val="single" w:sz="5" w:space="2" w:color="777777"/>
@@ -603,7 +588,7 @@
           <w:color w:val="181818"/>
           <w:sz w:val="18"/>
         </w:rPr>
-        <w:t>Spanish: native | English: upper-intermediate, Cambridge First-oriented coursework and functional workplace communication | Portuguese: A2 course completed</w:t>
+        <w:t>Spanish: native | English: upper-intermediate with functional workplace communication | Portuguese: A2</w:t>
       </w:r>
     </w:p>
     <w:p>
@@ -992,7 +977,7 @@
     <w:qFormat/>
     <w:rsid w:val="00FC693F"/>
     <w:pPr>
-      <w:spacing w:after="40" w:line="245" w:lineRule="auto"/>
+      <w:spacing w:after="40" w:line="283" w:lineRule="auto"/>
     </w:pPr>
     <w:rPr>
       <w:rFonts w:ascii="Arial" w:hAnsi="Arial"/>
@@ -1525,7 +1510,7 @@
       <w:numPr>
         <w:numId w:val="1"/>
       </w:numPr>
-      <w:spacing w:after="30" w:line="240" w:lineRule="auto"/>
+      <w:spacing w:after="27" w:line="276" w:lineRule="auto"/>
       <w:ind w:left="288" w:hanging="202"/>
       <w:contextualSpacing/>
     </w:pPr>

</xml_diff>

<commit_message>
Clarify Power Platform responsibilities
</commit_message>
<xml_diff>
--- a/documents/cv/Joaquin_Oviedo_CV_EN.docx
+++ b/documents/cv/Joaquin_Oviedo_CV_EN.docx
@@ -153,7 +153,7 @@
           <w:color w:val="181818"/>
           <w:sz w:val="19"/>
         </w:rPr>
-        <w:t>Development supervisor and software developer experienced in enterprise solutions with Power Platform, .NET, React, and TypeScript. I manage product evolution from discovery and feasibility through prioritization, delegation, and delivery. I take ownership of problems and use AI to explore and validate faster while remaining accountable for technical decisions, quality, and outcomes.</w:t>
+        <w:t>Development supervisor and software developer experienced in enterprise solutions with Power Platform, .NET, React, and TypeScript. I manage product evolution from discovery and feasibility through prioritization, delegation, and delivery, while contributing directly to development when the solution requires it.</w:t>
       </w:r>
     </w:p>
     <w:p>
@@ -226,7 +226,7 @@
           <w:color w:val="181818"/>
           <w:sz w:val="19"/>
         </w:rPr>
-        <w:t>Manage the day-to-day evolution of a cross-company corporate application: gather requests with the client user and functional analyst, assess feasibility, estimate, prioritize, and delegate work.</w:t>
+        <w:t>Manage and develop a corporate application used across business areas: gather needs with the client user and functional analyst, assess feasibility, estimate, prioritize, and distribute work.</w:t>
       </w:r>
     </w:p>
     <w:p>
@@ -241,7 +241,7 @@
           <w:color w:val="181818"/>
           <w:sz w:val="19"/>
         </w:rPr>
-        <w:t>Document use cases and validations; perform functional testing and capture evidence with Azure DevOps Test &amp; Feedback to support releases and issue tracking.</w:t>
+        <w:t>Document use cases, perform functional testing, and capture evidence with Azure DevOps Test &amp; Feedback to validate releases and track issues.</w:t>
       </w:r>
     </w:p>
     <w:p>
@@ -256,7 +256,22 @@
           <w:color w:val="181818"/>
           <w:sz w:val="19"/>
         </w:rPr>
-        <w:t>Manage roles and permissions across Dataverse, SharePoint sites and groups, and Microsoft Entra ID groups, aligning access with each user profile's responsibilities.</w:t>
+        <w:t>Configure Dataverse and Power Platform solutions: tables, columns, environment variables, Power Automate flows, test environments, and production releases.</w:t>
+      </w:r>
+    </w:p>
+    <w:p>
+      <w:pPr>
+        <w:pStyle w:val="ListBullet"/>
+      </w:pPr>
+      <w:r>
+        <w:rPr>
+          <w:rFonts w:ascii="Arial" w:hAnsi="Arial"/>
+          <w:b w:val="0"/>
+          <w:i w:val="0"/>
+          <w:color w:val="181818"/>
+          <w:sz w:val="19"/>
+        </w:rPr>
+        <w:t>Manage roles and permissions across Dataverse, SharePoint, and corporate AD groups, aligning access with each user profile's responsibilities.</w:t>
       </w:r>
     </w:p>
     <w:p>
@@ -329,7 +344,7 @@
           <w:color w:val="181818"/>
           <w:sz w:val="19"/>
         </w:rPr>
-        <w:t>Contributed mainly to the backend of a bibliographic accessibility system: ASP.NET Core Web API on .NET 8, Entity Framework Core, JWT, SQL Server/PostgreSQL, and Azure OCR integration.</w:t>
+        <w:t>Developed mainly the system backend: ASP.NET Core Web API on .NET 8, Entity Framework Core, JWT, SQL Server/PostgreSQL, and Azure OCR.</w:t>
       </w:r>
     </w:p>
     <w:p>
@@ -344,7 +359,7 @@
           <w:color w:val="181818"/>
           <w:sz w:val="19"/>
         </w:rPr>
-        <w:t>The team presented WIRIN at the 23rd University Digital Library Conference and is validating the product with library staff before its implementation at UNLaM's library.</w:t>
+        <w:t>The team presented WIRIN at the 23rd University Digital Library Conference and is validating it with library staff before implementation at UNLaM's library.</w:t>
       </w:r>
     </w:p>
     <w:p>
@@ -480,7 +495,7 @@
           <w:color w:val="181818"/>
           <w:sz w:val="19"/>
         </w:rPr>
-        <w:t>Power Apps, Power Automate, Dataverse, SharePoint, role and permission management</w:t>
+        <w:t>Power Apps, Power Automate, Dataverse, SharePoint, tables, environment variables, environments, production releases, roles, and permissions</w:t>
       </w:r>
     </w:p>
     <w:p>

</xml_diff>